<commit_message>
Update links after the GitHub account rename
Keep source, published documentation, and deployment references aligned with sfc-gh-dfreriks.

.... Generated with [Cortex Code](https://docs.snowflake.com/en/user-guide/cortex-code/cortex-code)

Co-Authored-By: Cortex Code <noreply@snowflake.com>
</commit_message>
<xml_diff>
--- a/docs/docx/06_References.docx
+++ b/docs/docx/06_References.docx
@@ -93,7 +93,7 @@
           <w:color w:val="29B5E8"/>
           <w:sz w:val="19"/>
         </w:rPr>
-        <w:t>dfreriks-snow/sap-bdc-finance-360</w:t>
+        <w:t>sfc-gh-dfreriks/sap-bdc-finance-360</w:t>
       </w:r>
       <w:r>
         <w:rPr>
@@ -101,7 +101,7 @@
           <w:color w:val="29B5E8"/>
           <w:sz w:val="20"/>
         </w:rPr>
-        <w:t xml:space="preserve"> (https://github.com/dfreriks-snow/sap-bdc-finance-360)</w:t>
+        <w:t xml:space="preserve"> (https://github.com/sfc-gh-dfreriks/sap-bdc-finance-360)</w:t>
       </w:r>
     </w:p>
     <w:p>

</xml_diff>